<commit_message>
Los manuales indican en qué pestaña se hace cada operación
Una pantalla con pestañas no se opera igual que una sin ellas: sin decir cuál,
quien sigue el manual abre la pantalla correcta y no encuentra el formulario.

Las pestañas se leen de los propios .aspx -las once pantallas que las tienen,
entre RadTab de las fichas modales y las pestañas de los centros 360-, no de
una lista escrita a mano. Cuando el nombre de la pestaña aparece en el título
de la operación, el manual la señala; si no, lista las que hay para que el
lector elija con criterio.

La búsqueda recorre todas las pantallas del módulo y no solo la primera,
porque la pantalla visible del menú muchas veces no es la que tiene las
pestañas: en Planes las tiene el Centro del plan, que se abre desde
Planificación.

Co-Authored-By: Claude Opus 5 <noreply@anthropic.com>
</commit_message>
<xml_diff>
--- a/Fase 2/Manuales/SIGMA_Manual_EP01_Acceso_seguridad_y_multicliente.docx
+++ b/Fase 2/Manuales/SIGMA_Manual_EP01_Acceso_seguridad_y_multicliente.docx
@@ -535,13 +535,14 @@
         </w:tblBorders>
       </w:tblPr>
       <w:tblGrid>
-        <w:gridCol w:w="4873"/>
-        <w:gridCol w:w="4873"/>
+        <w:gridCol w:w="3249"/>
+        <w:gridCol w:w="3249"/>
+        <w:gridCol w:w="3249"/>
       </w:tblGrid>
       <w:tr>
         <w:tc>
           <w:tcPr>
-            <w:tcW w:type="dxa" w:w="3402"/>
+            <w:tcW w:type="dxa" w:w="2551"/>
             <w:shd w:val="clear" w:color="auto" w:fill="E8E5F7"/>
           </w:tcPr>
           <w:p>
@@ -557,7 +558,7 @@
         </w:tc>
         <w:tc>
           <w:tcPr>
-            <w:tcW w:type="dxa" w:w="6236"/>
+            <w:tcW w:type="dxa" w:w="3969"/>
             <w:shd w:val="clear" w:color="auto" w:fill="E8E5F7"/>
           </w:tcPr>
           <w:p>
@@ -567,7 +568,23 @@
                 <w:b/>
                 <w:sz w:val="19"/>
               </w:rPr>
-              <w:t>Ruta</w:t>
+              <w:t>Ruta en el menú</w:t>
+            </w:r>
+          </w:p>
+        </w:tc>
+        <w:tc>
+          <w:tcPr>
+            <w:tcW w:type="dxa" w:w="3118"/>
+            <w:shd w:val="clear" w:color="auto" w:fill="E8E5F7"/>
+          </w:tcPr>
+          <w:p>
+            <w:r/>
+            <w:r>
+              <w:rPr>
+                <w:b/>
+                <w:sz w:val="19"/>
+              </w:rPr>
+              <w:t>Pestañas que tiene</w:t>
             </w:r>
           </w:p>
         </w:tc>
@@ -575,7 +592,7 @@
       <w:tr>
         <w:tc>
           <w:tcPr>
-            <w:tcW w:type="dxa" w:w="3402"/>
+            <w:tcW w:type="dxa" w:w="2551"/>
           </w:tcPr>
           <w:p>
             <w:r/>
@@ -589,7 +606,7 @@
         </w:tc>
         <w:tc>
           <w:tcPr>
-            <w:tcW w:type="dxa" w:w="6236"/>
+            <w:tcW w:type="dxa" w:w="3969"/>
           </w:tcPr>
           <w:p>
             <w:r/>
@@ -601,11 +618,25 @@
             </w:r>
           </w:p>
         </w:tc>
+        <w:tc>
+          <w:tcPr>
+            <w:tcW w:type="dxa" w:w="3118"/>
+          </w:tcPr>
+          <w:p>
+            <w:r/>
+            <w:r>
+              <w:rPr>
+                <w:sz w:val="19"/>
+              </w:rPr>
+              <w:t>—</w:t>
+            </w:r>
+          </w:p>
+        </w:tc>
       </w:tr>
       <w:tr>
         <w:tc>
           <w:tcPr>
-            <w:tcW w:type="dxa" w:w="3402"/>
+            <w:tcW w:type="dxa" w:w="2551"/>
           </w:tcPr>
           <w:p>
             <w:r/>
@@ -619,7 +650,7 @@
         </w:tc>
         <w:tc>
           <w:tcPr>
-            <w:tcW w:type="dxa" w:w="6236"/>
+            <w:tcW w:type="dxa" w:w="3969"/>
           </w:tcPr>
           <w:p>
             <w:r/>
@@ -631,11 +662,25 @@
             </w:r>
           </w:p>
         </w:tc>
+        <w:tc>
+          <w:tcPr>
+            <w:tcW w:type="dxa" w:w="3118"/>
+          </w:tcPr>
+          <w:p>
+            <w:r/>
+            <w:r>
+              <w:rPr>
+                <w:sz w:val="19"/>
+              </w:rPr>
+              <w:t>—</w:t>
+            </w:r>
+          </w:p>
+        </w:tc>
       </w:tr>
       <w:tr>
         <w:tc>
           <w:tcPr>
-            <w:tcW w:type="dxa" w:w="3402"/>
+            <w:tcW w:type="dxa" w:w="2551"/>
           </w:tcPr>
           <w:p>
             <w:r/>
@@ -649,7 +694,7 @@
         </w:tc>
         <w:tc>
           <w:tcPr>
-            <w:tcW w:type="dxa" w:w="6236"/>
+            <w:tcW w:type="dxa" w:w="3969"/>
           </w:tcPr>
           <w:p>
             <w:r/>
@@ -661,11 +706,25 @@
             </w:r>
           </w:p>
         </w:tc>
+        <w:tc>
+          <w:tcPr>
+            <w:tcW w:type="dxa" w:w="3118"/>
+          </w:tcPr>
+          <w:p>
+            <w:r/>
+            <w:r>
+              <w:rPr>
+                <w:sz w:val="19"/>
+              </w:rPr>
+              <w:t>—</w:t>
+            </w:r>
+          </w:p>
+        </w:tc>
       </w:tr>
       <w:tr>
         <w:tc>
           <w:tcPr>
-            <w:tcW w:type="dxa" w:w="3402"/>
+            <w:tcW w:type="dxa" w:w="2551"/>
           </w:tcPr>
           <w:p>
             <w:r/>
@@ -679,7 +738,7 @@
         </w:tc>
         <w:tc>
           <w:tcPr>
-            <w:tcW w:type="dxa" w:w="6236"/>
+            <w:tcW w:type="dxa" w:w="3969"/>
           </w:tcPr>
           <w:p>
             <w:r/>
@@ -691,11 +750,25 @@
             </w:r>
           </w:p>
         </w:tc>
+        <w:tc>
+          <w:tcPr>
+            <w:tcW w:type="dxa" w:w="3118"/>
+          </w:tcPr>
+          <w:p>
+            <w:r/>
+            <w:r>
+              <w:rPr>
+                <w:sz w:val="19"/>
+              </w:rPr>
+              <w:t>—</w:t>
+            </w:r>
+          </w:p>
+        </w:tc>
       </w:tr>
       <w:tr>
         <w:tc>
           <w:tcPr>
-            <w:tcW w:type="dxa" w:w="3402"/>
+            <w:tcW w:type="dxa" w:w="2551"/>
           </w:tcPr>
           <w:p>
             <w:r/>
@@ -709,7 +782,7 @@
         </w:tc>
         <w:tc>
           <w:tcPr>
-            <w:tcW w:type="dxa" w:w="6236"/>
+            <w:tcW w:type="dxa" w:w="3969"/>
           </w:tcPr>
           <w:p>
             <w:r/>
@@ -721,11 +794,25 @@
             </w:r>
           </w:p>
         </w:tc>
+        <w:tc>
+          <w:tcPr>
+            <w:tcW w:type="dxa" w:w="3118"/>
+          </w:tcPr>
+          <w:p>
+            <w:r/>
+            <w:r>
+              <w:rPr>
+                <w:sz w:val="19"/>
+              </w:rPr>
+              <w:t>—</w:t>
+            </w:r>
+          </w:p>
+        </w:tc>
       </w:tr>
       <w:tr>
         <w:tc>
           <w:tcPr>
-            <w:tcW w:type="dxa" w:w="3402"/>
+            <w:tcW w:type="dxa" w:w="2551"/>
           </w:tcPr>
           <w:p>
             <w:r/>
@@ -739,7 +826,7 @@
         </w:tc>
         <w:tc>
           <w:tcPr>
-            <w:tcW w:type="dxa" w:w="6236"/>
+            <w:tcW w:type="dxa" w:w="3969"/>
           </w:tcPr>
           <w:p>
             <w:r/>
@@ -751,11 +838,25 @@
             </w:r>
           </w:p>
         </w:tc>
+        <w:tc>
+          <w:tcPr>
+            <w:tcW w:type="dxa" w:w="3118"/>
+          </w:tcPr>
+          <w:p>
+            <w:r/>
+            <w:r>
+              <w:rPr>
+                <w:sz w:val="19"/>
+              </w:rPr>
+              <w:t>—</w:t>
+            </w:r>
+          </w:p>
+        </w:tc>
       </w:tr>
       <w:tr>
         <w:tc>
           <w:tcPr>
-            <w:tcW w:type="dxa" w:w="3402"/>
+            <w:tcW w:type="dxa" w:w="2551"/>
           </w:tcPr>
           <w:p>
             <w:r/>
@@ -769,7 +870,7 @@
         </w:tc>
         <w:tc>
           <w:tcPr>
-            <w:tcW w:type="dxa" w:w="6236"/>
+            <w:tcW w:type="dxa" w:w="3969"/>
           </w:tcPr>
           <w:p>
             <w:r/>
@@ -781,11 +882,25 @@
             </w:r>
           </w:p>
         </w:tc>
+        <w:tc>
+          <w:tcPr>
+            <w:tcW w:type="dxa" w:w="3118"/>
+          </w:tcPr>
+          <w:p>
+            <w:r/>
+            <w:r>
+              <w:rPr>
+                <w:sz w:val="19"/>
+              </w:rPr>
+              <w:t>—</w:t>
+            </w:r>
+          </w:p>
+        </w:tc>
       </w:tr>
       <w:tr>
         <w:tc>
           <w:tcPr>
-            <w:tcW w:type="dxa" w:w="3402"/>
+            <w:tcW w:type="dxa" w:w="2551"/>
           </w:tcPr>
           <w:p>
             <w:r/>
@@ -799,7 +914,7 @@
         </w:tc>
         <w:tc>
           <w:tcPr>
-            <w:tcW w:type="dxa" w:w="6236"/>
+            <w:tcW w:type="dxa" w:w="3969"/>
           </w:tcPr>
           <w:p>
             <w:r/>
@@ -811,11 +926,25 @@
             </w:r>
           </w:p>
         </w:tc>
+        <w:tc>
+          <w:tcPr>
+            <w:tcW w:type="dxa" w:w="3118"/>
+          </w:tcPr>
+          <w:p>
+            <w:r/>
+            <w:r>
+              <w:rPr>
+                <w:sz w:val="19"/>
+              </w:rPr>
+              <w:t>—</w:t>
+            </w:r>
+          </w:p>
+        </w:tc>
       </w:tr>
       <w:tr>
         <w:tc>
           <w:tcPr>
-            <w:tcW w:type="dxa" w:w="3402"/>
+            <w:tcW w:type="dxa" w:w="2551"/>
           </w:tcPr>
           <w:p>
             <w:r/>
@@ -829,7 +958,7 @@
         </w:tc>
         <w:tc>
           <w:tcPr>
-            <w:tcW w:type="dxa" w:w="6236"/>
+            <w:tcW w:type="dxa" w:w="3969"/>
           </w:tcPr>
           <w:p>
             <w:r/>
@@ -841,11 +970,25 @@
             </w:r>
           </w:p>
         </w:tc>
+        <w:tc>
+          <w:tcPr>
+            <w:tcW w:type="dxa" w:w="3118"/>
+          </w:tcPr>
+          <w:p>
+            <w:r/>
+            <w:r>
+              <w:rPr>
+                <w:sz w:val="19"/>
+              </w:rPr>
+              <w:t>—</w:t>
+            </w:r>
+          </w:p>
+        </w:tc>
       </w:tr>
       <w:tr>
         <w:tc>
           <w:tcPr>
-            <w:tcW w:type="dxa" w:w="3402"/>
+            <w:tcW w:type="dxa" w:w="2551"/>
           </w:tcPr>
           <w:p>
             <w:r/>
@@ -859,7 +1002,7 @@
         </w:tc>
         <w:tc>
           <w:tcPr>
-            <w:tcW w:type="dxa" w:w="6236"/>
+            <w:tcW w:type="dxa" w:w="3969"/>
           </w:tcPr>
           <w:p>
             <w:r/>
@@ -868,6 +1011,20 @@
                 <w:sz w:val="19"/>
               </w:rPr>
               <w:t>Sistema › Acceso › Mantenedor</w:t>
+            </w:r>
+          </w:p>
+        </w:tc>
+        <w:tc>
+          <w:tcPr>
+            <w:tcW w:type="dxa" w:w="3118"/>
+          </w:tcPr>
+          <w:p>
+            <w:r/>
+            <w:r>
+              <w:rPr>
+                <w:sz w:val="19"/>
+              </w:rPr>
+              <w:t>—</w:t>
             </w:r>
           </w:p>
         </w:tc>
@@ -907,13 +1064,14 @@
         </w:tblBorders>
       </w:tblPr>
       <w:tblGrid>
-        <w:gridCol w:w="4873"/>
-        <w:gridCol w:w="4873"/>
+        <w:gridCol w:w="3249"/>
+        <w:gridCol w:w="3249"/>
+        <w:gridCol w:w="3249"/>
       </w:tblGrid>
       <w:tr>
         <w:tc>
           <w:tcPr>
-            <w:tcW w:type="dxa" w:w="3402"/>
+            <w:tcW w:type="dxa" w:w="2551"/>
             <w:shd w:val="clear" w:color="auto" w:fill="E8E5F7"/>
           </w:tcPr>
           <w:p>
@@ -929,7 +1087,7 @@
         </w:tc>
         <w:tc>
           <w:tcPr>
-            <w:tcW w:type="dxa" w:w="6236"/>
+            <w:tcW w:type="dxa" w:w="3969"/>
             <w:shd w:val="clear" w:color="auto" w:fill="E8E5F7"/>
           </w:tcPr>
           <w:p>
@@ -943,11 +1101,27 @@
             </w:r>
           </w:p>
         </w:tc>
+        <w:tc>
+          <w:tcPr>
+            <w:tcW w:type="dxa" w:w="3118"/>
+            <w:shd w:val="clear" w:color="auto" w:fill="E8E5F7"/>
+          </w:tcPr>
+          <w:p>
+            <w:r/>
+            <w:r>
+              <w:rPr>
+                <w:b/>
+                <w:sz w:val="18"/>
+              </w:rPr>
+              <w:t>Pestañas que tiene</w:t>
+            </w:r>
+          </w:p>
+        </w:tc>
       </w:tr>
       <w:tr>
         <w:tc>
           <w:tcPr>
-            <w:tcW w:type="dxa" w:w="3402"/>
+            <w:tcW w:type="dxa" w:w="2551"/>
           </w:tcPr>
           <w:p>
             <w:r/>
@@ -961,7 +1135,7 @@
         </w:tc>
         <w:tc>
           <w:tcPr>
-            <w:tcW w:type="dxa" w:w="6236"/>
+            <w:tcW w:type="dxa" w:w="3969"/>
           </w:tcPr>
           <w:p>
             <w:r/>
@@ -973,11 +1147,25 @@
             </w:r>
           </w:p>
         </w:tc>
+        <w:tc>
+          <w:tcPr>
+            <w:tcW w:type="dxa" w:w="3118"/>
+          </w:tcPr>
+          <w:p>
+            <w:r/>
+            <w:r>
+              <w:rPr>
+                <w:sz w:val="18"/>
+              </w:rPr>
+              <w:t>—</w:t>
+            </w:r>
+          </w:p>
+        </w:tc>
       </w:tr>
       <w:tr>
         <w:tc>
           <w:tcPr>
-            <w:tcW w:type="dxa" w:w="3402"/>
+            <w:tcW w:type="dxa" w:w="2551"/>
           </w:tcPr>
           <w:p>
             <w:r/>
@@ -991,7 +1179,7 @@
         </w:tc>
         <w:tc>
           <w:tcPr>
-            <w:tcW w:type="dxa" w:w="6236"/>
+            <w:tcW w:type="dxa" w:w="3969"/>
           </w:tcPr>
           <w:p>
             <w:r/>
@@ -1003,11 +1191,25 @@
             </w:r>
           </w:p>
         </w:tc>
+        <w:tc>
+          <w:tcPr>
+            <w:tcW w:type="dxa" w:w="3118"/>
+          </w:tcPr>
+          <w:p>
+            <w:r/>
+            <w:r>
+              <w:rPr>
+                <w:sz w:val="18"/>
+              </w:rPr>
+              <w:t>Identidad · Perfiles · Paises</w:t>
+            </w:r>
+          </w:p>
+        </w:tc>
       </w:tr>
       <w:tr>
         <w:tc>
           <w:tcPr>
-            <w:tcW w:type="dxa" w:w="3402"/>
+            <w:tcW w:type="dxa" w:w="2551"/>
           </w:tcPr>
           <w:p>
             <w:r/>
@@ -1021,7 +1223,7 @@
         </w:tc>
         <w:tc>
           <w:tcPr>
-            <w:tcW w:type="dxa" w:w="6236"/>
+            <w:tcW w:type="dxa" w:w="3969"/>
           </w:tcPr>
           <w:p>
             <w:r/>
@@ -1033,11 +1235,25 @@
             </w:r>
           </w:p>
         </w:tc>
+        <w:tc>
+          <w:tcPr>
+            <w:tcW w:type="dxa" w:w="3118"/>
+          </w:tcPr>
+          <w:p>
+            <w:r/>
+            <w:r>
+              <w:rPr>
+                <w:sz w:val="18"/>
+              </w:rPr>
+              <w:t>—</w:t>
+            </w:r>
+          </w:p>
+        </w:tc>
       </w:tr>
       <w:tr>
         <w:tc>
           <w:tcPr>
-            <w:tcW w:type="dxa" w:w="3402"/>
+            <w:tcW w:type="dxa" w:w="2551"/>
           </w:tcPr>
           <w:p>
             <w:r/>
@@ -1051,7 +1267,7 @@
         </w:tc>
         <w:tc>
           <w:tcPr>
-            <w:tcW w:type="dxa" w:w="6236"/>
+            <w:tcW w:type="dxa" w:w="3969"/>
           </w:tcPr>
           <w:p>
             <w:r/>
@@ -1063,11 +1279,25 @@
             </w:r>
           </w:p>
         </w:tc>
+        <w:tc>
+          <w:tcPr>
+            <w:tcW w:type="dxa" w:w="3118"/>
+          </w:tcPr>
+          <w:p>
+            <w:r/>
+            <w:r>
+              <w:rPr>
+                <w:sz w:val="18"/>
+              </w:rPr>
+              <w:t>—</w:t>
+            </w:r>
+          </w:p>
+        </w:tc>
       </w:tr>
       <w:tr>
         <w:tc>
           <w:tcPr>
-            <w:tcW w:type="dxa" w:w="3402"/>
+            <w:tcW w:type="dxa" w:w="2551"/>
           </w:tcPr>
           <w:p>
             <w:r/>
@@ -1081,7 +1311,7 @@
         </w:tc>
         <w:tc>
           <w:tcPr>
-            <w:tcW w:type="dxa" w:w="6236"/>
+            <w:tcW w:type="dxa" w:w="3969"/>
           </w:tcPr>
           <w:p>
             <w:r/>
@@ -1093,11 +1323,25 @@
             </w:r>
           </w:p>
         </w:tc>
+        <w:tc>
+          <w:tcPr>
+            <w:tcW w:type="dxa" w:w="3118"/>
+          </w:tcPr>
+          <w:p>
+            <w:r/>
+            <w:r>
+              <w:rPr>
+                <w:sz w:val="18"/>
+              </w:rPr>
+              <w:t>—</w:t>
+            </w:r>
+          </w:p>
+        </w:tc>
       </w:tr>
       <w:tr>
         <w:tc>
           <w:tcPr>
-            <w:tcW w:type="dxa" w:w="3402"/>
+            <w:tcW w:type="dxa" w:w="2551"/>
           </w:tcPr>
           <w:p>
             <w:r/>
@@ -1111,7 +1355,7 @@
         </w:tc>
         <w:tc>
           <w:tcPr>
-            <w:tcW w:type="dxa" w:w="6236"/>
+            <w:tcW w:type="dxa" w:w="3969"/>
           </w:tcPr>
           <w:p>
             <w:r/>
@@ -1123,11 +1367,25 @@
             </w:r>
           </w:p>
         </w:tc>
+        <w:tc>
+          <w:tcPr>
+            <w:tcW w:type="dxa" w:w="3118"/>
+          </w:tcPr>
+          <w:p>
+            <w:r/>
+            <w:r>
+              <w:rPr>
+                <w:sz w:val="18"/>
+              </w:rPr>
+              <w:t>—</w:t>
+            </w:r>
+          </w:p>
+        </w:tc>
       </w:tr>
       <w:tr>
         <w:tc>
           <w:tcPr>
-            <w:tcW w:type="dxa" w:w="3402"/>
+            <w:tcW w:type="dxa" w:w="2551"/>
           </w:tcPr>
           <w:p>
             <w:r/>
@@ -1141,7 +1399,7 @@
         </w:tc>
         <w:tc>
           <w:tcPr>
-            <w:tcW w:type="dxa" w:w="6236"/>
+            <w:tcW w:type="dxa" w:w="3969"/>
           </w:tcPr>
           <w:p>
             <w:r/>
@@ -1153,11 +1411,25 @@
             </w:r>
           </w:p>
         </w:tc>
+        <w:tc>
+          <w:tcPr>
+            <w:tcW w:type="dxa" w:w="3118"/>
+          </w:tcPr>
+          <w:p>
+            <w:r/>
+            <w:r>
+              <w:rPr>
+                <w:sz w:val="18"/>
+              </w:rPr>
+              <w:t>—</w:t>
+            </w:r>
+          </w:p>
+        </w:tc>
       </w:tr>
       <w:tr>
         <w:tc>
           <w:tcPr>
-            <w:tcW w:type="dxa" w:w="3402"/>
+            <w:tcW w:type="dxa" w:w="2551"/>
           </w:tcPr>
           <w:p>
             <w:r/>
@@ -1171,7 +1443,7 @@
         </w:tc>
         <w:tc>
           <w:tcPr>
-            <w:tcW w:type="dxa" w:w="6236"/>
+            <w:tcW w:type="dxa" w:w="3969"/>
           </w:tcPr>
           <w:p>
             <w:r/>
@@ -1183,11 +1455,25 @@
             </w:r>
           </w:p>
         </w:tc>
+        <w:tc>
+          <w:tcPr>
+            <w:tcW w:type="dxa" w:w="3118"/>
+          </w:tcPr>
+          <w:p>
+            <w:r/>
+            <w:r>
+              <w:rPr>
+                <w:sz w:val="18"/>
+              </w:rPr>
+              <w:t>—</w:t>
+            </w:r>
+          </w:p>
+        </w:tc>
       </w:tr>
       <w:tr>
         <w:tc>
           <w:tcPr>
-            <w:tcW w:type="dxa" w:w="3402"/>
+            <w:tcW w:type="dxa" w:w="2551"/>
           </w:tcPr>
           <w:p>
             <w:r/>
@@ -1201,7 +1487,7 @@
         </w:tc>
         <w:tc>
           <w:tcPr>
-            <w:tcW w:type="dxa" w:w="6236"/>
+            <w:tcW w:type="dxa" w:w="3969"/>
           </w:tcPr>
           <w:p>
             <w:r/>
@@ -1213,11 +1499,25 @@
             </w:r>
           </w:p>
         </w:tc>
+        <w:tc>
+          <w:tcPr>
+            <w:tcW w:type="dxa" w:w="3118"/>
+          </w:tcPr>
+          <w:p>
+            <w:r/>
+            <w:r>
+              <w:rPr>
+                <w:sz w:val="18"/>
+              </w:rPr>
+              <w:t>—</w:t>
+            </w:r>
+          </w:p>
+        </w:tc>
       </w:tr>
       <w:tr>
         <w:tc>
           <w:tcPr>
-            <w:tcW w:type="dxa" w:w="3402"/>
+            <w:tcW w:type="dxa" w:w="2551"/>
           </w:tcPr>
           <w:p>
             <w:r/>
@@ -1231,7 +1531,7 @@
         </w:tc>
         <w:tc>
           <w:tcPr>
-            <w:tcW w:type="dxa" w:w="6236"/>
+            <w:tcW w:type="dxa" w:w="3969"/>
           </w:tcPr>
           <w:p>
             <w:r/>
@@ -1243,11 +1543,25 @@
             </w:r>
           </w:p>
         </w:tc>
+        <w:tc>
+          <w:tcPr>
+            <w:tcW w:type="dxa" w:w="3118"/>
+          </w:tcPr>
+          <w:p>
+            <w:r/>
+            <w:r>
+              <w:rPr>
+                <w:sz w:val="18"/>
+              </w:rPr>
+              <w:t>—</w:t>
+            </w:r>
+          </w:p>
+        </w:tc>
       </w:tr>
       <w:tr>
         <w:tc>
           <w:tcPr>
-            <w:tcW w:type="dxa" w:w="3402"/>
+            <w:tcW w:type="dxa" w:w="2551"/>
           </w:tcPr>
           <w:p>
             <w:r/>
@@ -1261,7 +1575,7 @@
         </w:tc>
         <w:tc>
           <w:tcPr>
-            <w:tcW w:type="dxa" w:w="6236"/>
+            <w:tcW w:type="dxa" w:w="3969"/>
           </w:tcPr>
           <w:p>
             <w:r/>
@@ -1270,6 +1584,20 @@
                 <w:sz w:val="18"/>
               </w:rPr>
               <w:t>Cliente › Usuarios › Permiso de usuario (detalle)</w:t>
+            </w:r>
+          </w:p>
+        </w:tc>
+        <w:tc>
+          <w:tcPr>
+            <w:tcW w:type="dxa" w:w="3118"/>
+          </w:tcPr>
+          <w:p>
+            <w:r/>
+            <w:r>
+              <w:rPr>
+                <w:sz w:val="18"/>
+              </w:rPr>
+              <w:t>—</w:t>
             </w:r>
           </w:p>
         </w:tc>
@@ -1366,6 +1694,38 @@
           <w:sz w:val="21"/>
         </w:rPr>
         <w:t xml:space="preserve">Paso 2. </w:t>
+      </w:r>
+      <w:r>
+        <w:rPr>
+          <w:sz w:val="21"/>
+        </w:rPr>
+        <w:t>Abra Usuario (detalle).</w:t>
+      </w:r>
+    </w:p>
+    <w:p>
+      <w:pPr>
+        <w:spacing w:after="120"/>
+        <w:ind w:left="680"/>
+      </w:pPr>
+      <w:r>
+        <w:rPr>
+          <w:color w:val="555555"/>
+          <w:sz w:val="19"/>
+        </w:rPr>
+        <w:t>Tiene estas pestañas: Identidad · Perfiles · Paises</w:t>
+      </w:r>
+    </w:p>
+    <w:p>
+      <w:pPr>
+        <w:spacing w:after="40"/>
+      </w:pPr>
+      <w:r>
+        <w:rPr>
+          <w:b/>
+          <w:color w:val="4F46E5"/>
+          <w:sz w:val="21"/>
+        </w:rPr>
+        <w:t xml:space="preserve">Paso 3. </w:t>
       </w:r>
       <w:r>
         <w:rPr>
@@ -1663,7 +2023,7 @@
           <w:color w:val="4F46E5"/>
           <w:sz w:val="21"/>
         </w:rPr>
-        <w:t xml:space="preserve">Paso 3. </w:t>
+        <w:t xml:space="preserve">Paso 4. </w:t>
       </w:r>
       <w:r>
         <w:rPr>
@@ -1682,7 +2042,7 @@
           <w:color w:val="4F46E5"/>
           <w:sz w:val="21"/>
         </w:rPr>
-        <w:t xml:space="preserve">Paso 4. </w:t>
+        <w:t xml:space="preserve">Paso 5. </w:t>
       </w:r>
       <w:r>
         <w:rPr>
@@ -2025,6 +2385,38 @@
         <w:rPr>
           <w:sz w:val="21"/>
         </w:rPr>
+        <w:t>Abra Usuario (detalle).</w:t>
+      </w:r>
+    </w:p>
+    <w:p>
+      <w:pPr>
+        <w:spacing w:after="120"/>
+        <w:ind w:left="680"/>
+      </w:pPr>
+      <w:r>
+        <w:rPr>
+          <w:color w:val="555555"/>
+          <w:sz w:val="19"/>
+        </w:rPr>
+        <w:t>Tiene estas pestañas: Identidad · Perfiles · Paises</w:t>
+      </w:r>
+    </w:p>
+    <w:p>
+      <w:pPr>
+        <w:spacing w:after="40"/>
+      </w:pPr>
+      <w:r>
+        <w:rPr>
+          <w:b/>
+          <w:color w:val="4F46E5"/>
+          <w:sz w:val="21"/>
+        </w:rPr>
+        <w:t xml:space="preserve">Paso 3. </w:t>
+      </w:r>
+      <w:r>
+        <w:rPr>
+          <w:sz w:val="21"/>
+        </w:rPr>
         <w:t>Ejecute la acción desde la pantalla.</w:t>
       </w:r>
     </w:p>
@@ -2038,7 +2430,7 @@
           <w:color w:val="4F46E5"/>
           <w:sz w:val="21"/>
         </w:rPr>
-        <w:t xml:space="preserve">Paso 3. </w:t>
+        <w:t xml:space="preserve">Paso 4. </w:t>
       </w:r>
       <w:r>
         <w:rPr>
@@ -2337,6 +2729,38 @@
         <w:rPr>
           <w:sz w:val="21"/>
         </w:rPr>
+        <w:t>Abra Usuario (detalle).</w:t>
+      </w:r>
+    </w:p>
+    <w:p>
+      <w:pPr>
+        <w:spacing w:after="120"/>
+        <w:ind w:left="680"/>
+      </w:pPr>
+      <w:r>
+        <w:rPr>
+          <w:color w:val="555555"/>
+          <w:sz w:val="19"/>
+        </w:rPr>
+        <w:t>Tiene estas pestañas: Identidad · Perfiles · Paises</w:t>
+      </w:r>
+    </w:p>
+    <w:p>
+      <w:pPr>
+        <w:spacing w:after="40"/>
+      </w:pPr>
+      <w:r>
+        <w:rPr>
+          <w:b/>
+          <w:color w:val="4F46E5"/>
+          <w:sz w:val="21"/>
+        </w:rPr>
+        <w:t xml:space="preserve">Paso 3. </w:t>
+      </w:r>
+      <w:r>
+        <w:rPr>
+          <w:sz w:val="21"/>
+        </w:rPr>
         <w:t>Abra el formulario y complete los datos.</w:t>
       </w:r>
     </w:p>
@@ -2513,7 +2937,7 @@
           <w:color w:val="4F46E5"/>
           <w:sz w:val="21"/>
         </w:rPr>
-        <w:t xml:space="preserve">Paso 3. </w:t>
+        <w:t xml:space="preserve">Paso 4. </w:t>
       </w:r>
       <w:r>
         <w:rPr>
@@ -2532,7 +2956,7 @@
           <w:color w:val="4F46E5"/>
           <w:sz w:val="21"/>
         </w:rPr>
-        <w:t xml:space="preserve">Paso 4. </w:t>
+        <w:t xml:space="preserve">Paso 5. </w:t>
       </w:r>
       <w:r>
         <w:rPr>
@@ -2831,6 +3255,38 @@
         <w:rPr>
           <w:sz w:val="21"/>
         </w:rPr>
+        <w:t>Abra Usuario (detalle).</w:t>
+      </w:r>
+    </w:p>
+    <w:p>
+      <w:pPr>
+        <w:spacing w:after="120"/>
+        <w:ind w:left="680"/>
+      </w:pPr>
+      <w:r>
+        <w:rPr>
+          <w:color w:val="555555"/>
+          <w:sz w:val="19"/>
+        </w:rPr>
+        <w:t>Tiene estas pestañas: Identidad · Perfiles · Paises</w:t>
+      </w:r>
+    </w:p>
+    <w:p>
+      <w:pPr>
+        <w:spacing w:after="40"/>
+      </w:pPr>
+      <w:r>
+        <w:rPr>
+          <w:b/>
+          <w:color w:val="4F46E5"/>
+          <w:sz w:val="21"/>
+        </w:rPr>
+        <w:t xml:space="preserve">Paso 3. </w:t>
+      </w:r>
+      <w:r>
+        <w:rPr>
+          <w:sz w:val="21"/>
+        </w:rPr>
         <w:t>Ejecute la acción desde la pantalla.</w:t>
       </w:r>
     </w:p>
@@ -2844,7 +3300,7 @@
           <w:color w:val="4F46E5"/>
           <w:sz w:val="21"/>
         </w:rPr>
-        <w:t xml:space="preserve">Paso 3. </w:t>
+        <w:t xml:space="preserve">Paso 4. </w:t>
       </w:r>
       <w:r>
         <w:rPr>
@@ -3138,6 +3594,38 @@
           <w:sz w:val="21"/>
         </w:rPr>
         <w:t xml:space="preserve">Paso 2. </w:t>
+      </w:r>
+      <w:r>
+        <w:rPr>
+          <w:sz w:val="21"/>
+        </w:rPr>
+        <w:t>Abra Usuario (detalle).</w:t>
+      </w:r>
+    </w:p>
+    <w:p>
+      <w:pPr>
+        <w:spacing w:after="120"/>
+        <w:ind w:left="680"/>
+      </w:pPr>
+      <w:r>
+        <w:rPr>
+          <w:color w:val="555555"/>
+          <w:sz w:val="19"/>
+        </w:rPr>
+        <w:t>Tiene estas pestañas: Identidad · Perfiles · Paises</w:t>
+      </w:r>
+    </w:p>
+    <w:p>
+      <w:pPr>
+        <w:spacing w:after="40"/>
+      </w:pPr>
+      <w:r>
+        <w:rPr>
+          <w:b/>
+          <w:color w:val="4F46E5"/>
+          <w:sz w:val="21"/>
+        </w:rPr>
+        <w:t xml:space="preserve">Paso 3. </w:t>
       </w:r>
       <w:r>
         <w:rPr>
@@ -3667,7 +4155,7 @@
           <w:color w:val="4F46E5"/>
           <w:sz w:val="21"/>
         </w:rPr>
-        <w:t xml:space="preserve">Paso 3. </w:t>
+        <w:t xml:space="preserve">Paso 4. </w:t>
       </w:r>
       <w:r>
         <w:rPr>
@@ -3686,7 +4174,7 @@
           <w:color w:val="4F46E5"/>
           <w:sz w:val="21"/>
         </w:rPr>
-        <w:t xml:space="preserve">Paso 4. </w:t>
+        <w:t xml:space="preserve">Paso 5. </w:t>
       </w:r>
       <w:r>
         <w:rPr>
@@ -3985,6 +4473,38 @@
         <w:rPr>
           <w:sz w:val="21"/>
         </w:rPr>
+        <w:t>Abra Usuario (detalle).</w:t>
+      </w:r>
+    </w:p>
+    <w:p>
+      <w:pPr>
+        <w:spacing w:after="120"/>
+        <w:ind w:left="680"/>
+      </w:pPr>
+      <w:r>
+        <w:rPr>
+          <w:color w:val="555555"/>
+          <w:sz w:val="19"/>
+        </w:rPr>
+        <w:t>Tiene estas pestañas: Identidad · Perfiles · Paises</w:t>
+      </w:r>
+    </w:p>
+    <w:p>
+      <w:pPr>
+        <w:spacing w:after="40"/>
+      </w:pPr>
+      <w:r>
+        <w:rPr>
+          <w:b/>
+          <w:color w:val="4F46E5"/>
+          <w:sz w:val="21"/>
+        </w:rPr>
+        <w:t xml:space="preserve">Paso 3. </w:t>
+      </w:r>
+      <w:r>
+        <w:rPr>
+          <w:sz w:val="21"/>
+        </w:rPr>
         <w:t>Abra el formulario y complete los datos.</w:t>
       </w:r>
     </w:p>
@@ -4277,7 +4797,7 @@
           <w:color w:val="4F46E5"/>
           <w:sz w:val="21"/>
         </w:rPr>
-        <w:t xml:space="preserve">Paso 3. </w:t>
+        <w:t xml:space="preserve">Paso 4. </w:t>
       </w:r>
       <w:r>
         <w:rPr>
@@ -4296,7 +4816,7 @@
           <w:color w:val="4F46E5"/>
           <w:sz w:val="21"/>
         </w:rPr>
-        <w:t xml:space="preserve">Paso 4. </w:t>
+        <w:t xml:space="preserve">Paso 5. </w:t>
       </w:r>
       <w:r>
         <w:rPr>
@@ -4590,6 +5110,38 @@
           <w:sz w:val="21"/>
         </w:rPr>
         <w:t xml:space="preserve">Paso 2. </w:t>
+      </w:r>
+      <w:r>
+        <w:rPr>
+          <w:sz w:val="21"/>
+        </w:rPr>
+        <w:t>Abra Usuario (detalle).</w:t>
+      </w:r>
+    </w:p>
+    <w:p>
+      <w:pPr>
+        <w:spacing w:after="120"/>
+        <w:ind w:left="680"/>
+      </w:pPr>
+      <w:r>
+        <w:rPr>
+          <w:color w:val="555555"/>
+          <w:sz w:val="19"/>
+        </w:rPr>
+        <w:t>Tiene estas pestañas: Identidad · Perfiles · Paises</w:t>
+      </w:r>
+    </w:p>
+    <w:p>
+      <w:pPr>
+        <w:spacing w:after="40"/>
+      </w:pPr>
+      <w:r>
+        <w:rPr>
+          <w:b/>
+          <w:color w:val="4F46E5"/>
+          <w:sz w:val="21"/>
+        </w:rPr>
+        <w:t xml:space="preserve">Paso 3. </w:t>
       </w:r>
       <w:r>
         <w:rPr>
@@ -5003,7 +5555,7 @@
           <w:color w:val="4F46E5"/>
           <w:sz w:val="21"/>
         </w:rPr>
-        <w:t xml:space="preserve">Paso 3. </w:t>
+        <w:t xml:space="preserve">Paso 4. </w:t>
       </w:r>
       <w:r>
         <w:rPr>
@@ -5022,7 +5574,7 @@
           <w:color w:val="4F46E5"/>
           <w:sz w:val="21"/>
         </w:rPr>
-        <w:t xml:space="preserve">Paso 4. </w:t>
+        <w:t xml:space="preserve">Paso 5. </w:t>
       </w:r>
       <w:r>
         <w:rPr>

</xml_diff>